<commit_message>
feat: implement items 9-15 — i18n gates, XLSX/PDF/DOCX export, evidence upload, period lock, accessibility, test account, Korean docs
- Item 9: Anti-drift gate tests (catalog-coverage, action-message-coverage, ui-copy-drift)
- Item 10: Real XLSX/PDF/DOCX export with exceljs and pdfkit
- Item 11: Evidence upload with Supabase Storage (graceful fallback)
- Item 12: Period close/lock + approval workflow (PERIOD_LOCKED guard)
- Item 13: Accessibility (axe-core, skip link, mobile drawer)
- Item 14: Korean docs update, test account panel on login page
- Item 15: All gates pass (93 files, 1721 tests, lint/typecheck/build clean)

Test account: admin@example.com (auto-login when Supabase unconfigured)
Korean is the default locale with English switchable via header.

Co-authored-by: ESGBRAIN <238979934+musclebreadbread-stack@users.noreply.github.com>
</commit_message>
<xml_diff>
--- a/docs/CIOS-직접-설정-가이드.docx
+++ b/docs/CIOS-직접-설정-가이드.docx
@@ -5809,7 +5809,477 @@
           <w:b/>
           <w:bCs/>
         </w:rPr>
-        <w:t xml:space="preserve">12. 미구현 · 외부 의존 기능 목록</w:t>
+        <w:t xml:space="preserve">12. 테스트 계정 및 신규 기능 안내</w:t>
+      </w:r>
+    </w:p>
+    <w:p>
+      <w:pPr>
+        <w:spacing w:after="120" w:line="300"/>
+      </w:pPr>
+      <w:r>
+        <w:rPr>
+          <w:b w:val="false"/>
+          <w:bCs w:val="false"/>
+        </w:rPr>
+        <w:t xml:space="preserve">Supabase 미구성 시 자동으로 활성화되는 내장 테스트 계정과, 이번 업데이트에서 추가된 기능을 설명합니다.</w:t>
+      </w:r>
+    </w:p>
+    <w:p>
+      <w:pPr>
+        <w:spacing w:after="120" w:line="300"/>
+      </w:pPr>
+      <w:r>
+        <w:rPr>
+          <w:b w:val="false"/>
+          <w:bCs w:val="false"/>
+        </w:rPr>
+        <w:t xml:space="preserve">내장 테스트/데모 계정: Supabase가 구성되지 않으면 아래 계정으로 자동 로그인됩니다.</w:t>
+      </w:r>
+    </w:p>
+    <w:p>
+      <w:pPr>
+        <w:spacing w:after="120" w:line="300"/>
+      </w:pPr>
+      <w:r>
+        <w:rPr>
+          <w:b/>
+          <w:bCs/>
+        </w:rPr>
+        <w:t xml:space="preserve">표 12-1. 테스트 계정 정보</w:t>
+      </w:r>
+    </w:p>
+    <w:tbl>
+      <w:tblPr>
+        <w:tblW w:type="pct" w:w="100%"/>
+        <w:tblBorders>
+          <w:top w:val="single" w:color="BFBFBF" w:sz="4"/>
+          <w:left w:val="single" w:color="BFBFBF" w:sz="4"/>
+          <w:bottom w:val="single" w:color="BFBFBF" w:sz="4"/>
+          <w:right w:val="single" w:color="BFBFBF" w:sz="4"/>
+          <w:insideH w:val="single" w:color="BFBFBF" w:sz="2"/>
+          <w:insideV w:val="single" w:color="BFBFBF" w:sz="2"/>
+        </w:tblBorders>
+      </w:tblPr>
+      <w:tblGrid>
+        <w:gridCol w:w="100"/>
+        <w:gridCol w:w="100"/>
+      </w:tblGrid>
+      <w:tr>
+        <w:trPr>
+          <w:tblHeader/>
+        </w:trPr>
+        <w:tc>
+          <w:tcPr>
+            <w:shd w:fill="E7E6E6" w:val="clear"/>
+            <w:tcMar>
+              <w:top w:type="dxa" w:w="60"/>
+              <w:left w:type="dxa" w:w="100"/>
+              <w:bottom w:type="dxa" w:w="60"/>
+              <w:right w:type="dxa" w:w="100"/>
+            </w:tcMar>
+            <w:vAlign w:val="top"/>
+          </w:tcPr>
+          <w:p>
+            <w:pPr>
+              <w:spacing w:after="0" w:line="260"/>
+            </w:pPr>
+            <w:r>
+              <w:rPr>
+                <w:b/>
+                <w:bCs/>
+                <w:sz w:val="18"/>
+                <w:szCs w:val="18"/>
+              </w:rPr>
+              <w:t xml:space="preserve">항목</w:t>
+            </w:r>
+          </w:p>
+        </w:tc>
+        <w:tc>
+          <w:tcPr>
+            <w:shd w:fill="E7E6E6" w:val="clear"/>
+            <w:tcMar>
+              <w:top w:type="dxa" w:w="60"/>
+              <w:left w:type="dxa" w:w="100"/>
+              <w:bottom w:type="dxa" w:w="60"/>
+              <w:right w:type="dxa" w:w="100"/>
+            </w:tcMar>
+            <w:vAlign w:val="top"/>
+          </w:tcPr>
+          <w:p>
+            <w:pPr>
+              <w:spacing w:after="0" w:line="260"/>
+            </w:pPr>
+            <w:r>
+              <w:rPr>
+                <w:b/>
+                <w:bCs/>
+                <w:sz w:val="18"/>
+                <w:szCs w:val="18"/>
+              </w:rPr>
+              <w:t xml:space="preserve">값</w:t>
+            </w:r>
+          </w:p>
+        </w:tc>
+      </w:tr>
+      <w:tr>
+        <w:tc>
+          <w:tcPr>
+            <w:tcMar>
+              <w:top w:type="dxa" w:w="60"/>
+              <w:left w:type="dxa" w:w="100"/>
+              <w:bottom w:type="dxa" w:w="60"/>
+              <w:right w:type="dxa" w:w="100"/>
+            </w:tcMar>
+            <w:vAlign w:val="top"/>
+          </w:tcPr>
+          <w:p>
+            <w:pPr>
+              <w:spacing w:after="0" w:line="260"/>
+            </w:pPr>
+            <w:r>
+              <w:rPr>
+                <w:b w:val="false"/>
+                <w:bCs w:val="false"/>
+                <w:sz w:val="18"/>
+                <w:szCs w:val="18"/>
+              </w:rPr>
+              <w:t xml:space="preserve">이메일</w:t>
+            </w:r>
+          </w:p>
+        </w:tc>
+        <w:tc>
+          <w:tcPr>
+            <w:tcMar>
+              <w:top w:type="dxa" w:w="60"/>
+              <w:left w:type="dxa" w:w="100"/>
+              <w:bottom w:type="dxa" w:w="60"/>
+              <w:right w:type="dxa" w:w="100"/>
+            </w:tcMar>
+            <w:vAlign w:val="top"/>
+          </w:tcPr>
+          <w:p>
+            <w:pPr>
+              <w:spacing w:after="0" w:line="260"/>
+            </w:pPr>
+            <w:r>
+              <w:rPr>
+                <w:b w:val="false"/>
+                <w:bCs w:val="false"/>
+                <w:sz w:val="18"/>
+                <w:szCs w:val="18"/>
+              </w:rPr>
+              <w:t xml:space="preserve">admin@example.com</w:t>
+            </w:r>
+          </w:p>
+        </w:tc>
+      </w:tr>
+      <w:tr>
+        <w:tc>
+          <w:tcPr>
+            <w:tcMar>
+              <w:top w:type="dxa" w:w="60"/>
+              <w:left w:type="dxa" w:w="100"/>
+              <w:bottom w:type="dxa" w:w="60"/>
+              <w:right w:type="dxa" w:w="100"/>
+            </w:tcMar>
+            <w:vAlign w:val="top"/>
+          </w:tcPr>
+          <w:p>
+            <w:pPr>
+              <w:spacing w:after="0" w:line="260"/>
+            </w:pPr>
+            <w:r>
+              <w:rPr>
+                <w:b w:val="false"/>
+                <w:bCs w:val="false"/>
+                <w:sz w:val="18"/>
+                <w:szCs w:val="18"/>
+              </w:rPr>
+              <w:t xml:space="preserve">이름</w:t>
+            </w:r>
+          </w:p>
+        </w:tc>
+        <w:tc>
+          <w:tcPr>
+            <w:tcMar>
+              <w:top w:type="dxa" w:w="60"/>
+              <w:left w:type="dxa" w:w="100"/>
+              <w:bottom w:type="dxa" w:w="60"/>
+              <w:right w:type="dxa" w:w="100"/>
+            </w:tcMar>
+            <w:vAlign w:val="top"/>
+          </w:tcPr>
+          <w:p>
+            <w:pPr>
+              <w:spacing w:after="0" w:line="260"/>
+            </w:pPr>
+            <w:r>
+              <w:rPr>
+                <w:b w:val="false"/>
+                <w:bCs w:val="false"/>
+                <w:sz w:val="18"/>
+                <w:szCs w:val="18"/>
+              </w:rPr>
+              <w:t xml:space="preserve">데모 관리자</w:t>
+            </w:r>
+          </w:p>
+        </w:tc>
+      </w:tr>
+      <w:tr>
+        <w:tc>
+          <w:tcPr>
+            <w:tcMar>
+              <w:top w:type="dxa" w:w="60"/>
+              <w:left w:type="dxa" w:w="100"/>
+              <w:bottom w:type="dxa" w:w="60"/>
+              <w:right w:type="dxa" w:w="100"/>
+            </w:tcMar>
+            <w:vAlign w:val="top"/>
+          </w:tcPr>
+          <w:p>
+            <w:pPr>
+              <w:spacing w:after="0" w:line="260"/>
+            </w:pPr>
+            <w:r>
+              <w:rPr>
+                <w:b w:val="false"/>
+                <w:bCs w:val="false"/>
+                <w:sz w:val="18"/>
+                <w:szCs w:val="18"/>
+              </w:rPr>
+              <w:t xml:space="preserve">역할</w:t>
+            </w:r>
+          </w:p>
+        </w:tc>
+        <w:tc>
+          <w:tcPr>
+            <w:tcMar>
+              <w:top w:type="dxa" w:w="60"/>
+              <w:left w:type="dxa" w:w="100"/>
+              <w:bottom w:type="dxa" w:w="60"/>
+              <w:right w:type="dxa" w:w="100"/>
+            </w:tcMar>
+            <w:vAlign w:val="top"/>
+          </w:tcPr>
+          <w:p>
+            <w:pPr>
+              <w:spacing w:after="0" w:line="260"/>
+            </w:pPr>
+            <w:r>
+              <w:rPr>
+                <w:b w:val="false"/>
+                <w:bCs w:val="false"/>
+                <w:sz w:val="18"/>
+                <w:szCs w:val="18"/>
+              </w:rPr>
+              <w:t xml:space="preserve">조직 관리자 (전체 권한)</w:t>
+            </w:r>
+          </w:p>
+        </w:tc>
+      </w:tr>
+      <w:tr>
+        <w:tc>
+          <w:tcPr>
+            <w:tcMar>
+              <w:top w:type="dxa" w:w="60"/>
+              <w:left w:type="dxa" w:w="100"/>
+              <w:bottom w:type="dxa" w:w="60"/>
+              <w:right w:type="dxa" w:w="100"/>
+            </w:tcMar>
+            <w:vAlign w:val="top"/>
+          </w:tcPr>
+          <w:p>
+            <w:pPr>
+              <w:spacing w:after="0" w:line="260"/>
+            </w:pPr>
+            <w:r>
+              <w:rPr>
+                <w:b w:val="false"/>
+                <w:bCs w:val="false"/>
+                <w:sz w:val="18"/>
+                <w:szCs w:val="18"/>
+              </w:rPr>
+              <w:t xml:space="preserve">비밀번호</w:t>
+            </w:r>
+          </w:p>
+        </w:tc>
+        <w:tc>
+          <w:tcPr>
+            <w:tcMar>
+              <w:top w:type="dxa" w:w="60"/>
+              <w:left w:type="dxa" w:w="100"/>
+              <w:bottom w:type="dxa" w:w="60"/>
+              <w:right w:type="dxa" w:w="100"/>
+            </w:tcMar>
+            <w:vAlign w:val="top"/>
+          </w:tcPr>
+          <w:p>
+            <w:pPr>
+              <w:spacing w:after="0" w:line="260"/>
+            </w:pPr>
+            <w:r>
+              <w:rPr>
+                <w:b w:val="false"/>
+                <w:bCs w:val="false"/>
+                <w:sz w:val="18"/>
+                <w:szCs w:val="18"/>
+              </w:rPr>
+              <w:t xml:space="preserve">불필요 — 자동 세션 부여</w:t>
+            </w:r>
+          </w:p>
+        </w:tc>
+      </w:tr>
+    </w:tbl>
+    <w:p>
+      <w:pPr>
+        <w:spacing w:after="160"/>
+      </w:pPr>
+    </w:p>
+    <w:p>
+      <w:pPr>
+        <w:spacing w:after="120" w:line="300"/>
+      </w:pPr>
+      <w:r>
+        <w:rPr>
+          <w:b w:val="false"/>
+          <w:bCs w:val="false"/>
+        </w:rPr>
+        <w:t xml:space="preserve">이번 업데이트에서 추가된 기능:</w:t>
+      </w:r>
+    </w:p>
+    <w:p>
+      <w:pPr>
+        <w:spacing w:after="100" w:line="300"/>
+        <w:ind w:left="360" w:hanging="240"/>
+      </w:pPr>
+      <w:r>
+        <w:t xml:space="preserve">· </w:t>
+      </w:r>
+      <w:r>
+        <w:t xml:space="preserve">XLSX/PDF/DOCX 실제 파일 내보내기: GET /api/reports/:id/export?format=xlsx|pdf|docx</w:t>
+      </w:r>
+    </w:p>
+    <w:p>
+      <w:pPr>
+        <w:spacing w:after="100" w:line="300"/>
+        <w:ind w:left="360" w:hanging="240"/>
+      </w:pPr>
+      <w:r>
+        <w:t xml:space="preserve">· </w:t>
+      </w:r>
+      <w:r>
+        <w:t xml:space="preserve">증거 파일 업로드: POST /api/evidence (Supabase Storage 연동, 미구성 시 안내 메시지 반환)</w:t>
+      </w:r>
+    </w:p>
+    <w:p>
+      <w:pPr>
+        <w:spacing w:after="100" w:line="300"/>
+        <w:ind w:left="360" w:hanging="240"/>
+      </w:pPr>
+      <w:r>
+        <w:t xml:space="preserve">· </w:t>
+      </w:r>
+      <w:r>
+        <w:t xml:space="preserve">기간 마감/잠금 + 승인 워크플로: 잠긴 기간에는 PERIOD_LOCKED 에러로 변경이 차단됩니다.</w:t>
+      </w:r>
+    </w:p>
+    <w:p>
+      <w:pPr>
+        <w:spacing w:after="100" w:line="300"/>
+        <w:ind w:left="360" w:hanging="240"/>
+      </w:pPr>
+      <w:r>
+        <w:t xml:space="preserve">· </w:t>
+      </w:r>
+      <w:r>
+        <w:t xml:space="preserve">접근성 개선: 스킵 링크, 모바일 드로어, axe-core 기반 자동 검증</w:t>
+      </w:r>
+    </w:p>
+    <w:p>
+      <w:pPr>
+        <w:spacing w:after="100" w:line="300"/>
+        <w:ind w:left="360" w:hanging="240"/>
+      </w:pPr>
+      <w:r>
+        <w:t xml:space="preserve">· </w:t>
+      </w:r>
+      <w:r>
+        <w:t xml:space="preserve">i18n 안티 드리프트 게이트: 딕셔너리 키 동기화, 액션 메시지 한국어 커버리지, UI 복사 드리프트 탐지</w:t>
+      </w:r>
+    </w:p>
+    <w:p>
+      <w:pPr>
+        <w:pStyle w:val="Heading2"/>
+        <w:spacing w:after="100" w:before="200"/>
+      </w:pPr>
+      <w:r>
+        <w:rPr>
+          <w:b/>
+          <w:bCs/>
+        </w:rPr>
+        <w:t xml:space="preserve">예상 비용</w:t>
+      </w:r>
+    </w:p>
+    <w:p>
+      <w:pPr>
+        <w:spacing w:after="120" w:line="300"/>
+      </w:pPr>
+      <w:r>
+        <w:rPr>
+          <w:b w:val="false"/>
+          <w:bCs w:val="false"/>
+        </w:rPr>
+        <w:t xml:space="preserve">무료 (내장 기능입니다).</w:t>
+      </w:r>
+    </w:p>
+    <w:p>
+      <w:pPr>
+        <w:pStyle w:val="Heading2"/>
+        <w:spacing w:after="100" w:before="200"/>
+      </w:pPr>
+      <w:r>
+        <w:rPr>
+          <w:b/>
+          <w:bCs/>
+        </w:rPr>
+        <w:t xml:space="preserve">완료 확인 방법</w:t>
+      </w:r>
+    </w:p>
+    <w:p>
+      <w:pPr>
+        <w:spacing w:after="100" w:line="300"/>
+        <w:ind w:left="360" w:hanging="240"/>
+      </w:pPr>
+      <w:r>
+        <w:t xml:space="preserve">· </w:t>
+      </w:r>
+      <w:r>
+        <w:t xml:space="preserve">로그인 화면에서 '테스트 계정' 패널이 표시되고, '대시보드로 이동' 버튼이 동작합니다.</w:t>
+      </w:r>
+    </w:p>
+    <w:p>
+      <w:pPr>
+        <w:spacing w:after="100" w:line="300"/>
+        <w:ind w:left="360" w:hanging="240"/>
+      </w:pPr>
+      <w:r>
+        <w:t xml:space="preserve">· </w:t>
+      </w:r>
+      <w:r>
+        <w:t xml:space="preserve">ESG 공시 화면에서 XLSX/PDF/DOCX 다운로드가 실제 파일을 생성합니다.</w:t>
+      </w:r>
+    </w:p>
+    <w:p>
+      <w:pPr>
+        <w:pStyle w:val="Heading1"/>
+        <w:spacing w:after="140" w:before="320"/>
+      </w:pPr>
+      <w:r>
+        <w:rPr>
+          <w:b/>
+          <w:bCs/>
+        </w:rPr>
+        <w:t xml:space="preserve">13. 미구현 · 외부 의존 기능 목록</w:t>
       </w:r>
     </w:p>
     <w:p>
@@ -6137,32 +6607,32 @@
                 <w:sz w:val="18"/>
                 <w:szCs w:val="18"/>
               </w:rPr>
-              <w:t xml:space="preserve">메시지 테이블(src/lib/i18n/messages.ts)에 ko 컬럼이 있고 데모·오류·설정 안내는 한국어를 제공하지만, 화면 문구는 설계상 영어입니다.</w:t>
-            </w:r>
-          </w:p>
-        </w:tc>
-        <w:tc>
-          <w:tcPr>
-            <w:tcMar>
-              <w:top w:type="dxa" w:w="60"/>
-              <w:left w:type="dxa" w:w="100"/>
-              <w:bottom w:type="dxa" w:w="60"/>
-              <w:right w:type="dxa" w:w="100"/>
-            </w:tcMar>
-            <w:vAlign w:val="top"/>
-          </w:tcPr>
-          <w:p>
-            <w:pPr>
-              <w:spacing w:after="0" w:line="260"/>
-            </w:pPr>
-            <w:r>
-              <w:rPr>
-                <w:b w:val="false"/>
-                <w:bCs w:val="false"/>
-                <w:sz w:val="18"/>
-                <w:szCs w:val="18"/>
-              </w:rPr>
-              <w:t xml:space="preserve">전면 한국어화가 필요하면 각 페이지 문구를 메시지 테이블 경유로 전환하는 i18n 후속 작업을 진행하십시오.</w:t>
+              <w:t xml:space="preserve">완료. 전체 UI가 한국어를 기본값으로 사용하며, 설정에서 영문으로 전환할 수 있습니다. 딕셔너리 기반 i18n이 모든 페이지에 적용되어 있습니다.</w:t>
+            </w:r>
+          </w:p>
+        </w:tc>
+        <w:tc>
+          <w:tcPr>
+            <w:tcMar>
+              <w:top w:type="dxa" w:w="60"/>
+              <w:left w:type="dxa" w:w="100"/>
+              <w:bottom w:type="dxa" w:w="60"/>
+              <w:right w:type="dxa" w:w="100"/>
+            </w:tcMar>
+            <w:vAlign w:val="top"/>
+          </w:tcPr>
+          <w:p>
+            <w:pPr>
+              <w:spacing w:after="0" w:line="260"/>
+            </w:pPr>
+            <w:r>
+              <w:rPr>
+                <w:b w:val="false"/>
+                <w:bCs w:val="false"/>
+                <w:sz w:val="18"/>
+                <w:szCs w:val="18"/>
+              </w:rPr>
+              <w:t xml:space="preserve">추가 문구가 필요하면 src/lib/i18n/dictionaries/{ko,en}.ts에 키를 추가하십시오.</w:t>
             </w:r>
           </w:p>
         </w:tc>
@@ -6214,32 +6684,32 @@
                 <w:sz w:val="18"/>
                 <w:szCs w:val="18"/>
               </w:rPr>
-              <w:t xml:space="preserve">APIKey 모델에 rateLimit 컬럼이 없고 베이스라인 마이그레이션이 동결되어 있어, 전역 기본값(API_RATE_LIMIT_PER_MINUTE)과 `rate:unlimited` 스코프 예외만 지원합니다.</w:t>
-            </w:r>
-          </w:p>
-        </w:tc>
-        <w:tc>
-          <w:tcPr>
-            <w:tcMar>
-              <w:top w:type="dxa" w:w="60"/>
-              <w:left w:type="dxa" w:w="100"/>
-              <w:bottom w:type="dxa" w:w="60"/>
-              <w:right w:type="dxa" w:w="100"/>
-            </w:tcMar>
-            <w:vAlign w:val="top"/>
-          </w:tcPr>
-          <w:p>
-            <w:pPr>
-              <w:spacing w:after="0" w:line="260"/>
-            </w:pPr>
-            <w:r>
-              <w:rPr>
-                <w:b w:val="false"/>
-                <w:bCs w:val="false"/>
-                <w:sz w:val="18"/>
-                <w:szCs w:val="18"/>
-              </w:rPr>
-              <w:t xml:space="preserve">키별 한도가 필요하면 스키마에 컬럼을 추가하고 새 마이그레이션을 생성한 뒤 rateLimitForKey를 확장하십시오.</w:t>
+              <w:t xml:space="preserve">완료. APIKey 모델에 rateLimit 컬럼이 추가되어 키별 개별 한도를 설정할 수 있습니다.</w:t>
+            </w:r>
+          </w:p>
+        </w:tc>
+        <w:tc>
+          <w:tcPr>
+            <w:tcMar>
+              <w:top w:type="dxa" w:w="60"/>
+              <w:left w:type="dxa" w:w="100"/>
+              <w:bottom w:type="dxa" w:w="60"/>
+              <w:right w:type="dxa" w:w="100"/>
+            </w:tcMar>
+            <w:vAlign w:val="top"/>
+          </w:tcPr>
+          <w:p>
+            <w:pPr>
+              <w:spacing w:after="0" w:line="260"/>
+            </w:pPr>
+            <w:r>
+              <w:rPr>
+                <w:b w:val="false"/>
+                <w:bCs w:val="false"/>
+                <w:sz w:val="18"/>
+                <w:szCs w:val="18"/>
+              </w:rPr>
+              <w:t xml:space="preserve">관리자 화면에서 키 생성 시 rateLimit 값을 지정하거나, 기본값(API_RATE_LIMIT_PER_MINUTE)을 사용하십시오.</w:t>
             </w:r>
           </w:p>
         </w:tc>

</xml_diff>

<commit_message>
docs: sync Korean Word document with 19 dashboard pages, full i18n, and recent features
Co-authored-by: ESGBRAIN <238979934+musclebreadbread-stack@users.noreply.github.com>
</commit_message>
<xml_diff>
--- a/docs/CIOS-직접-설정-가이드.docx
+++ b/docs/CIOS-직접-설정-가이드.docx
@@ -100,7 +100,7 @@
           <w:b w:val="false"/>
           <w:bCs w:val="false"/>
         </w:rPr>
-        <w:t xml:space="preserve">환경변수를 하나도 설정하지 않아도 애플리케이션은 실행됩니다. 이 '데모 모드'에서 18개 대시보드 화면의 모든 수치는 내장 샘플 데이터를 실제 계산 엔진으로 계산한 값이며, 저장(쓰기) 동작만 거부됩니다. 즉, 지금 화면에 보이는 숫자는 하드코딩된 값이 아니라 계산된 값이고, 데이터베이스를 연결하는 즉시 같은 엔진이 실제 데이터를 계산합니다.</w:t>
+        <w:t xml:space="preserve">환경변수를 하나도 설정하지 않아도 애플리케이션은 실행됩니다. 이 '데모 모드'에서 19개 대시보드 화면의 모든 수치는 내장 샘플 데이터를 실제 계산 엔진으로 계산한 값이며, 저장(쓰기) 동작만 거부됩니다. 즉, 지금 화면에 보이는 숫자는 하드코딩된 값이 아니라 계산된 값이고, 데이터베이스를 연결하는 즉시 같은 엔진이 실제 데이터를 계산합니다.</w:t>
       </w:r>
     </w:p>
     <w:p>
@@ -1390,7 +1390,7 @@
           <w:b w:val="false"/>
           <w:bCs w:val="false"/>
         </w:rPr>
-        <w:t xml:space="preserve">이 시스템은 환경변수가 하나도 없어도 실행됩니다. 이때는 '데모 모드'로 동작하며, 18개 대시보드 화면의 모든 수치는 내장 샘플 데이터를 실제 계산 엔진(Scope 1/2/3 산정, SBTi 경로, 시나리오, MACC, 크레딧, 공시 매핑, MRV)으로 계산한 값입니다. 저장(쓰기) 동작만 거부됩니다.</w:t>
+        <w:t xml:space="preserve">이 시스템은 환경변수가 하나도 없어도 실행됩니다. 이때는 '데모 모드'로 동작하며, 19개 대시보드 화면의 모든 수치는 내장 샘플 데이터를 실제 계산 엔진(Scope 1/2/3 산정, SBTi 경로, 시나리오, MACC, 크레딧, 공시 매핑, MRV)으로 계산한 값입니다. 저장(쓰기) 동작만 거부됩니다.</w:t>
       </w:r>
     </w:p>
     <w:p>
@@ -6209,6 +6209,54 @@
     </w:p>
     <w:p>
       <w:pPr>
+        <w:spacing w:after="100" w:line="300"/>
+        <w:ind w:left="360" w:hanging="240"/>
+      </w:pPr>
+      <w:r>
+        <w:t xml:space="preserve">· </w:t>
+      </w:r>
+      <w:r>
+        <w:t xml:space="preserve">전체 UI 한국어 번역 완료: 19개 대시보드 페이지의 모든 본문, 버튼, 폼 라벨, 탭, KPI, 차트 라벨이 딕셔너리 기반 한국어로 전환됨 (설정에서 영문 전환 가능)</w:t>
+      </w:r>
+    </w:p>
+    <w:p>
+      <w:pPr>
+        <w:spacing w:after="100" w:line="300"/>
+        <w:ind w:left="360" w:hanging="240"/>
+      </w:pPr>
+      <w:r>
+        <w:t xml:space="preserve">· </w:t>
+      </w:r>
+      <w:r>
+        <w:t xml:space="preserve">증빙 업로드 MIME/크기 제한: PDF, 이미지, Office 문서, CSV, ZIP만 허용, 최대 50MB</w:t>
+      </w:r>
+    </w:p>
+    <w:p>
+      <w:pPr>
+        <w:spacing w:after="100" w:line="300"/>
+        <w:ind w:left="360" w:hanging="240"/>
+      </w:pPr>
+      <w:r>
+        <w:t xml:space="preserve">· </w:t>
+      </w:r>
+      <w:r>
+        <w:t xml:space="preserve">ESG 공시 내보내기 완성도 100배 오류 수정 및 페이지 헤더에 다운로드 버튼 추가</w:t>
+      </w:r>
+    </w:p>
+    <w:p>
+      <w:pPr>
+        <w:spacing w:after="100" w:line="300"/>
+        <w:ind w:left="360" w:hanging="240"/>
+      </w:pPr>
+      <w:r>
+        <w:t xml:space="preserve">· </w:t>
+      </w:r>
+      <w:r>
+        <w:t xml:space="preserve">접근성: main-content ID, MobileDrawer 768px 이하 모바일 내비게이션, 사이드바 접기/펼치기 aria-label</w:t>
+      </w:r>
+    </w:p>
+    <w:p>
+      <w:pPr>
         <w:pStyle w:val="Heading2"/>
         <w:spacing w:after="100" w:before="200"/>
       </w:pPr>
@@ -6607,7 +6655,7 @@
                 <w:sz w:val="18"/>
                 <w:szCs w:val="18"/>
               </w:rPr>
-              <w:t xml:space="preserve">완료. 전체 UI가 한국어를 기본값으로 사용하며, 설정에서 영문으로 전환할 수 있습니다. 딕셔너리 기반 i18n이 모든 페이지에 적용되어 있습니다.</w:t>
+              <w:t xml:space="preserve">완료. 전체 UI가 한국어를 기본값으로 사용하며, 설정에서 영문으로 전환할 수 있습니다. 딕셔너리 기반 i18n이 모든 페이지의 제목, 본문, 버튼, 폼, 탭, KPI, 차트 라벨에 적용되어 있습니다.</w:t>
             </w:r>
           </w:p>
         </w:tc>

</xml_diff>

<commit_message>
docs: add this session's Phase B follow-ups to the self-setup guide
Section 12 (미구현·외부 의존 기능 목록) now lists the tenant-membership,
SSO/MFA, real object storage, Redis rate limiting, async calculation
processing, Decimal precision and dead-schema items that came out of
closing the P0 gaps — each with what is already done and what still
needs the user's own accounts/infra decisions.

Co-Authored-By: Claude Sonnet 5 <noreply@anthropic.com>
</commit_message>
<xml_diff>
--- a/docs/CIOS-직접-설정-가이드.docx
+++ b/docs/CIOS-직접-설정-가이드.docx
@@ -7157,6 +7157,622 @@
                 <w:szCs w:val="18"/>
               </w:rPr>
               <w:t xml:space="preserve">11절대로 CRON_SECRET을 설정한 뒤, Vercel Cron(vercel.json의 crons 항목) 또는 외부 스케줄러가 /api/cron/audit-archive를 주기 호출하도록 구성하십시오.</w:t>
+            </w:r>
+          </w:p>
+        </w:tc>
+      </w:tr>
+      <w:tr>
+        <w:tc>
+          <w:tcPr>
+            <w:tcMar>
+              <w:top w:type="dxa" w:w="60"/>
+              <w:left w:type="dxa" w:w="100"/>
+              <w:bottom w:type="dxa" w:w="60"/>
+              <w:right w:type="dxa" w:w="100"/>
+            </w:tcMar>
+            <w:vAlign w:val="top"/>
+          </w:tcPr>
+          <w:p>
+            <w:pPr>
+              <w:spacing w:after="0" w:line="260"/>
+            </w:pPr>
+            <w:r>
+              <w:rPr>
+                <w:b w:val="false"/>
+                <w:bCs w:val="false"/>
+                <w:sz w:val="18"/>
+                <w:szCs w:val="18"/>
+              </w:rPr>
+              <w:t xml:space="preserve">테넌트 간 데이터 격리(조직 멤버십)</w:t>
+            </w:r>
+          </w:p>
+        </w:tc>
+        <w:tc>
+          <w:tcPr>
+            <w:tcMar>
+              <w:top w:type="dxa" w:w="60"/>
+              <w:left w:type="dxa" w:w="100"/>
+              <w:bottom w:type="dxa" w:w="60"/>
+              <w:right w:type="dxa" w:w="100"/>
+            </w:tcMar>
+            <w:vAlign w:val="top"/>
+          </w:tcPr>
+          <w:p>
+            <w:pPr>
+              <w:spacing w:after="0" w:line="260"/>
+            </w:pPr>
+            <w:r>
+              <w:rPr>
+                <w:b w:val="false"/>
+                <w:bCs w:val="false"/>
+                <w:sz w:val="18"/>
+                <w:szCs w:val="18"/>
+              </w:rPr>
+              <w:t xml:space="preserve">구현 완료. OrganizationMembership 모델이 도입되어 조직 전환(활성 조직 스위처)이 배포 전체 조직 목록이 아니라 사용자의 실제 멤버십으로 검증됩니다. 감사 로그, 배출계수 시맨틱 검색, DataSource 조회에도 조직 필터가 추가되었습니다.</w:t>
+            </w:r>
+          </w:p>
+        </w:tc>
+        <w:tc>
+          <w:tcPr>
+            <w:tcMar>
+              <w:top w:type="dxa" w:w="60"/>
+              <w:left w:type="dxa" w:w="100"/>
+              <w:bottom w:type="dxa" w:w="60"/>
+              <w:right w:type="dxa" w:w="100"/>
+            </w:tcMar>
+            <w:vAlign w:val="top"/>
+          </w:tcPr>
+          <w:p>
+            <w:pPr>
+              <w:spacing w:after="0" w:line="260"/>
+            </w:pPr>
+            <w:r>
+              <w:rPr>
+                <w:b w:val="false"/>
+                <w:bCs w:val="false"/>
+                <w:sz w:val="18"/>
+                <w:szCs w:val="18"/>
+              </w:rPr>
+              <w:t xml:space="preserve">추가 조치가 필요하지 않습니다. 구성원 초대·역할 변경·접근 철회는 보안 화면의 '구성원' 탭에서 수행하십시오. 다만 PostgreSQL Row-Level Security(RLS)는 아직 적용되지 않아 애플리케이션 계층 검증에만 의존합니다 — 3절대로 데이터베이스를 프로비저닝한 뒤 RLS 정책 추가를 검토하십시오.</w:t>
+            </w:r>
+          </w:p>
+        </w:tc>
+      </w:tr>
+      <w:tr>
+        <w:tc>
+          <w:tcPr>
+            <w:tcMar>
+              <w:top w:type="dxa" w:w="60"/>
+              <w:left w:type="dxa" w:w="100"/>
+              <w:bottom w:type="dxa" w:w="60"/>
+              <w:right w:type="dxa" w:w="100"/>
+            </w:tcMar>
+            <w:vAlign w:val="top"/>
+          </w:tcPr>
+          <w:p>
+            <w:pPr>
+              <w:spacing w:after="0" w:line="260"/>
+            </w:pPr>
+            <w:r>
+              <w:rPr>
+                <w:b w:val="false"/>
+                <w:bCs w:val="false"/>
+                <w:sz w:val="18"/>
+                <w:szCs w:val="18"/>
+              </w:rPr>
+              <w:t xml:space="preserve">SSO/SAML/OIDC 및 다요소인증(MFA)</w:t>
+            </w:r>
+          </w:p>
+        </w:tc>
+        <w:tc>
+          <w:tcPr>
+            <w:tcMar>
+              <w:top w:type="dxa" w:w="60"/>
+              <w:left w:type="dxa" w:w="100"/>
+              <w:bottom w:type="dxa" w:w="60"/>
+              <w:right w:type="dxa" w:w="100"/>
+            </w:tcMar>
+            <w:vAlign w:val="top"/>
+          </w:tcPr>
+          <w:p>
+            <w:pPr>
+              <w:spacing w:after="0" w:line="260"/>
+            </w:pPr>
+            <w:r>
+              <w:rPr>
+                <w:b w:val="false"/>
+                <w:bCs w:val="false"/>
+                <w:sz w:val="18"/>
+                <w:szCs w:val="18"/>
+              </w:rPr>
+              <w:t xml:space="preserve">미구현. 현재 인증은 Supabase Auth(이메일·비밀번호) 또는 데모 세션만 지원합니다.</w:t>
+            </w:r>
+          </w:p>
+        </w:tc>
+        <w:tc>
+          <w:tcPr>
+            <w:tcMar>
+              <w:top w:type="dxa" w:w="60"/>
+              <w:left w:type="dxa" w:w="100"/>
+              <w:bottom w:type="dxa" w:w="60"/>
+              <w:right w:type="dxa" w:w="100"/>
+            </w:tcMar>
+            <w:vAlign w:val="top"/>
+          </w:tcPr>
+          <w:p>
+            <w:pPr>
+              <w:spacing w:after="0" w:line="260"/>
+            </w:pPr>
+            <w:r>
+              <w:rPr>
+                <w:b w:val="false"/>
+                <w:bCs w:val="false"/>
+                <w:sz w:val="18"/>
+                <w:szCs w:val="18"/>
+              </w:rPr>
+              <w:t xml:space="preserve">사내 SSO가 필요하면 Okta·Azure AD·Google Workspace 등 ID 공급자를 선정하고 Supabase Auth의 SAML/OIDC 커넥터를 설정하십시오. MFA는 별도 개발이 필요합니다.</w:t>
+            </w:r>
+          </w:p>
+        </w:tc>
+      </w:tr>
+      <w:tr>
+        <w:tc>
+          <w:tcPr>
+            <w:tcMar>
+              <w:top w:type="dxa" w:w="60"/>
+              <w:left w:type="dxa" w:w="100"/>
+              <w:bottom w:type="dxa" w:w="60"/>
+              <w:right w:type="dxa" w:w="100"/>
+            </w:tcMar>
+            <w:vAlign w:val="top"/>
+          </w:tcPr>
+          <w:p>
+            <w:pPr>
+              <w:spacing w:after="0" w:line="260"/>
+            </w:pPr>
+            <w:r>
+              <w:rPr>
+                <w:b w:val="false"/>
+                <w:bCs w:val="false"/>
+                <w:sz w:val="18"/>
+                <w:szCs w:val="18"/>
+              </w:rPr>
+              <w:t xml:space="preserve">배출량 계산 재실행 시 이중 합산</w:t>
+            </w:r>
+          </w:p>
+        </w:tc>
+        <w:tc>
+          <w:tcPr>
+            <w:tcMar>
+              <w:top w:type="dxa" w:w="60"/>
+              <w:left w:type="dxa" w:w="100"/>
+              <w:bottom w:type="dxa" w:w="60"/>
+              <w:right w:type="dxa" w:w="100"/>
+            </w:tcMar>
+            <w:vAlign w:val="top"/>
+          </w:tcPr>
+          <w:p>
+            <w:pPr>
+              <w:spacing w:after="0" w:line="260"/>
+            </w:pPr>
+            <w:r>
+              <w:rPr>
+                <w:b w:val="false"/>
+                <w:bCs w:val="false"/>
+                <w:sz w:val="18"/>
+                <w:szCs w:val="18"/>
+              </w:rPr>
+              <w:t xml:space="preserve">구현 완료(버그 수정). 동일 조직·연도를 재계산하면 이전 실행이 SUPERSEDED로 전이되고, 집계는 활성(COMPLETED) 실행만 반영합니다.</w:t>
+            </w:r>
+          </w:p>
+        </w:tc>
+        <w:tc>
+          <w:tcPr>
+            <w:tcMar>
+              <w:top w:type="dxa" w:w="60"/>
+              <w:left w:type="dxa" w:w="100"/>
+              <w:bottom w:type="dxa" w:w="60"/>
+              <w:right w:type="dxa" w:w="100"/>
+            </w:tcMar>
+            <w:vAlign w:val="top"/>
+          </w:tcPr>
+          <w:p>
+            <w:pPr>
+              <w:spacing w:after="0" w:line="260"/>
+            </w:pPr>
+            <w:r>
+              <w:rPr>
+                <w:b w:val="false"/>
+                <w:bCs w:val="false"/>
+                <w:sz w:val="18"/>
+                <w:szCs w:val="18"/>
+              </w:rPr>
+              <w:t xml:space="preserve">추가 조치가 필요하지 않습니다.</w:t>
+            </w:r>
+          </w:p>
+        </w:tc>
+      </w:tr>
+      <w:tr>
+        <w:tc>
+          <w:tcPr>
+            <w:tcMar>
+              <w:top w:type="dxa" w:w="60"/>
+              <w:left w:type="dxa" w:w="100"/>
+              <w:bottom w:type="dxa" w:w="60"/>
+              <w:right w:type="dxa" w:w="100"/>
+            </w:tcMar>
+            <w:vAlign w:val="top"/>
+          </w:tcPr>
+          <w:p>
+            <w:pPr>
+              <w:spacing w:after="0" w:line="260"/>
+            </w:pPr>
+            <w:r>
+              <w:rPr>
+                <w:b w:val="false"/>
+                <w:bCs w:val="false"/>
+                <w:sz w:val="18"/>
+                <w:szCs w:val="18"/>
+              </w:rPr>
+              <w:t xml:space="preserve">증빙 파일의 실제 오브젝트 스토리지 저장</w:t>
+            </w:r>
+          </w:p>
+        </w:tc>
+        <w:tc>
+          <w:tcPr>
+            <w:tcMar>
+              <w:top w:type="dxa" w:w="60"/>
+              <w:left w:type="dxa" w:w="100"/>
+              <w:bottom w:type="dxa" w:w="60"/>
+              <w:right w:type="dxa" w:w="100"/>
+            </w:tcMar>
+            <w:vAlign w:val="top"/>
+          </w:tcPr>
+          <w:p>
+            <w:pPr>
+              <w:spacing w:after="0" w:line="260"/>
+            </w:pPr>
+            <w:r>
+              <w:rPr>
+                <w:b w:val="false"/>
+                <w:bCs w:val="false"/>
+                <w:sz w:val="18"/>
+                <w:szCs w:val="18"/>
+              </w:rPr>
+              <w:t xml:space="preserve">부분 구현. src/lib/storage의 팩토리 패턴이 증빙 파일을 실제 바이트 기준으로 해시하지만, 저장소 자체는 프로세스 메모리(MemoryObjectStorageClient)뿐이라 프로세스 재시작 시 소실됩니다.</w:t>
+            </w:r>
+          </w:p>
+        </w:tc>
+        <w:tc>
+          <w:tcPr>
+            <w:tcMar>
+              <w:top w:type="dxa" w:w="60"/>
+              <w:left w:type="dxa" w:w="100"/>
+              <w:bottom w:type="dxa" w:w="60"/>
+              <w:right w:type="dxa" w:w="100"/>
+            </w:tcMar>
+            <w:vAlign w:val="top"/>
+          </w:tcPr>
+          <w:p>
+            <w:pPr>
+              <w:spacing w:after="0" w:line="260"/>
+            </w:pPr>
+            <w:r>
+              <w:rPr>
+                <w:b w:val="false"/>
+                <w:bCs w:val="false"/>
+                <w:sz w:val="18"/>
+                <w:szCs w:val="18"/>
+              </w:rPr>
+              <w:t xml:space="preserve">2절에서 만든 Supabase Storage 버킷(또는 S3)에 연결하는 구현체를 추가 개발해 getObjectStorageClient() 팩토리가 선택하도록 연결하십시오.</w:t>
+            </w:r>
+          </w:p>
+        </w:tc>
+      </w:tr>
+      <w:tr>
+        <w:tc>
+          <w:tcPr>
+            <w:tcMar>
+              <w:top w:type="dxa" w:w="60"/>
+              <w:left w:type="dxa" w:w="100"/>
+              <w:bottom w:type="dxa" w:w="60"/>
+              <w:right w:type="dxa" w:w="100"/>
+            </w:tcMar>
+            <w:vAlign w:val="top"/>
+          </w:tcPr>
+          <w:p>
+            <w:pPr>
+              <w:spacing w:after="0" w:line="260"/>
+            </w:pPr>
+            <w:r>
+              <w:rPr>
+                <w:b w:val="false"/>
+                <w:bCs w:val="false"/>
+                <w:sz w:val="18"/>
+                <w:szCs w:val="18"/>
+              </w:rPr>
+              <w:t xml:space="preserve">API 레이트리밋의 다중 인스턴스 지원</w:t>
+            </w:r>
+          </w:p>
+        </w:tc>
+        <w:tc>
+          <w:tcPr>
+            <w:tcMar>
+              <w:top w:type="dxa" w:w="60"/>
+              <w:left w:type="dxa" w:w="100"/>
+              <w:bottom w:type="dxa" w:w="60"/>
+              <w:right w:type="dxa" w:w="100"/>
+            </w:tcMar>
+            <w:vAlign w:val="top"/>
+          </w:tcPr>
+          <w:p>
+            <w:pPr>
+              <w:spacing w:after="0" w:line="260"/>
+            </w:pPr>
+            <w:r>
+              <w:rPr>
+                <w:b w:val="false"/>
+                <w:bCs w:val="false"/>
+                <w:sz w:val="18"/>
+                <w:szCs w:val="18"/>
+              </w:rPr>
+              <w:t xml:space="preserve">미구현. 현재 레이트리미터는 프로세스 메모리 기반이라 서버 인스턴스마다 한도가 개별 적용됩니다. getRateLimiter() 팩토리 접점은 준비되어 있습니다.</w:t>
+            </w:r>
+          </w:p>
+        </w:tc>
+        <w:tc>
+          <w:tcPr>
+            <w:tcMar>
+              <w:top w:type="dxa" w:w="60"/>
+              <w:left w:type="dxa" w:w="100"/>
+              <w:bottom w:type="dxa" w:w="60"/>
+              <w:right w:type="dxa" w:w="100"/>
+            </w:tcMar>
+            <w:vAlign w:val="top"/>
+          </w:tcPr>
+          <w:p>
+            <w:pPr>
+              <w:spacing w:after="0" w:line="260"/>
+            </w:pPr>
+            <w:r>
+              <w:rPr>
+                <w:b w:val="false"/>
+                <w:bCs w:val="false"/>
+                <w:sz w:val="18"/>
+                <w:szCs w:val="18"/>
+              </w:rPr>
+              <w:t xml:space="preserve">7절에서 준비한 Redis/Upstash에 연결하는 구현체를 추가하고 getRateLimiter()가 이를 반환하도록 교체하십시오.</w:t>
+            </w:r>
+          </w:p>
+        </w:tc>
+      </w:tr>
+      <w:tr>
+        <w:tc>
+          <w:tcPr>
+            <w:tcMar>
+              <w:top w:type="dxa" w:w="60"/>
+              <w:left w:type="dxa" w:w="100"/>
+              <w:bottom w:type="dxa" w:w="60"/>
+              <w:right w:type="dxa" w:w="100"/>
+            </w:tcMar>
+            <w:vAlign w:val="top"/>
+          </w:tcPr>
+          <w:p>
+            <w:pPr>
+              <w:spacing w:after="0" w:line="260"/>
+            </w:pPr>
+            <w:r>
+              <w:rPr>
+                <w:b w:val="false"/>
+                <w:bCs w:val="false"/>
+                <w:sz w:val="18"/>
+                <w:szCs w:val="18"/>
+              </w:rPr>
+              <w:t xml:space="preserve">배출량 계산의 비동기 처리</w:t>
+            </w:r>
+          </w:p>
+        </w:tc>
+        <w:tc>
+          <w:tcPr>
+            <w:tcMar>
+              <w:top w:type="dxa" w:w="60"/>
+              <w:left w:type="dxa" w:w="100"/>
+              <w:bottom w:type="dxa" w:w="60"/>
+              <w:right w:type="dxa" w:w="100"/>
+            </w:tcMar>
+            <w:vAlign w:val="top"/>
+          </w:tcPr>
+          <w:p>
+            <w:pPr>
+              <w:spacing w:after="0" w:line="260"/>
+            </w:pPr>
+            <w:r>
+              <w:rPr>
+                <w:b w:val="false"/>
+                <w:bCs w:val="false"/>
+                <w:sz w:val="18"/>
+                <w:szCs w:val="18"/>
+              </w:rPr>
+              <w:t xml:space="preserve">미구현. POST /api/v1/calculations는 요청 안에서 전체 계산을 동기 실행합니다(이전에는 202를 반환했으나 실제 동작과 맞지 않아 200으로 수정했습니다). 대량 데이터셋에서는 요청 타임아웃 위험이 있습니다.</w:t>
+            </w:r>
+          </w:p>
+        </w:tc>
+        <w:tc>
+          <w:tcPr>
+            <w:tcMar>
+              <w:top w:type="dxa" w:w="60"/>
+              <w:left w:type="dxa" w:w="100"/>
+              <w:bottom w:type="dxa" w:w="60"/>
+              <w:right w:type="dxa" w:w="100"/>
+            </w:tcMar>
+            <w:vAlign w:val="top"/>
+          </w:tcPr>
+          <w:p>
+            <w:pPr>
+              <w:spacing w:after="0" w:line="260"/>
+            </w:pPr>
+            <w:r>
+              <w:rPr>
+                <w:b w:val="false"/>
+                <w:bCs w:val="false"/>
+                <w:sz w:val="18"/>
+                <w:szCs w:val="18"/>
+              </w:rPr>
+              <w:t xml:space="preserve">대량 조직에서 타임아웃이 발생하면 Queue/Worker(Vercel Queue, BullMQ 등) 기반 비동기 처리와 상태 폴링 엔드포인트 도입을 검토하십시오.</w:t>
+            </w:r>
+          </w:p>
+        </w:tc>
+      </w:tr>
+      <w:tr>
+        <w:tc>
+          <w:tcPr>
+            <w:tcMar>
+              <w:top w:type="dxa" w:w="60"/>
+              <w:left w:type="dxa" w:w="100"/>
+              <w:bottom w:type="dxa" w:w="60"/>
+              <w:right w:type="dxa" w:w="100"/>
+            </w:tcMar>
+            <w:vAlign w:val="top"/>
+          </w:tcPr>
+          <w:p>
+            <w:pPr>
+              <w:spacing w:after="0" w:line="260"/>
+            </w:pPr>
+            <w:r>
+              <w:rPr>
+                <w:b w:val="false"/>
+                <w:bCs w:val="false"/>
+                <w:sz w:val="18"/>
+                <w:szCs w:val="18"/>
+              </w:rPr>
+              <w:t xml:space="preserve">금액·배출량 수치의 Decimal 정밀도</w:t>
+            </w:r>
+          </w:p>
+        </w:tc>
+        <w:tc>
+          <w:tcPr>
+            <w:tcMar>
+              <w:top w:type="dxa" w:w="60"/>
+              <w:left w:type="dxa" w:w="100"/>
+              <w:bottom w:type="dxa" w:w="60"/>
+              <w:right w:type="dxa" w:w="100"/>
+            </w:tcMar>
+            <w:vAlign w:val="top"/>
+          </w:tcPr>
+          <w:p>
+            <w:pPr>
+              <w:spacing w:after="0" w:line="260"/>
+            </w:pPr>
+            <w:r>
+              <w:rPr>
+                <w:b w:val="false"/>
+                <w:bCs w:val="false"/>
+                <w:sz w:val="18"/>
+                <w:szCs w:val="18"/>
+              </w:rPr>
+              <w:t xml:space="preserve">미구현. 배출량·통화 수치가 Prisma Float로 저장됩니다. 부동소수점 반올림 오차가 있을 수 있으나, 이번에 확인·수정된 문제는 정밀도가 아니라 재실행 시 이중 집계였습니다.</w:t>
+            </w:r>
+          </w:p>
+        </w:tc>
+        <w:tc>
+          <w:tcPr>
+            <w:tcMar>
+              <w:top w:type="dxa" w:w="60"/>
+              <w:left w:type="dxa" w:w="100"/>
+              <w:bottom w:type="dxa" w:w="60"/>
+              <w:right w:type="dxa" w:w="100"/>
+            </w:tcMar>
+            <w:vAlign w:val="top"/>
+          </w:tcPr>
+          <w:p>
+            <w:pPr>
+              <w:spacing w:after="0" w:line="260"/>
+            </w:pPr>
+            <w:r>
+              <w:rPr>
+                <w:b w:val="false"/>
+                <w:bCs w:val="false"/>
+                <w:sz w:val="18"/>
+                <w:szCs w:val="18"/>
+              </w:rPr>
+              <w:t xml:space="preserve">회계·감사상 소수점 정밀도가 계약상 요구되면 Decimal 컬럼 전환을 별도 프로젝트로 계획하십시오(도메인 계산 레이어 전체에 영향을 주는 규모입니다).</w:t>
+            </w:r>
+          </w:p>
+        </w:tc>
+      </w:tr>
+      <w:tr>
+        <w:tc>
+          <w:tcPr>
+            <w:tcMar>
+              <w:top w:type="dxa" w:w="60"/>
+              <w:left w:type="dxa" w:w="100"/>
+              <w:bottom w:type="dxa" w:w="60"/>
+              <w:right w:type="dxa" w:w="100"/>
+            </w:tcMar>
+            <w:vAlign w:val="top"/>
+          </w:tcPr>
+          <w:p>
+            <w:pPr>
+              <w:spacing w:after="0" w:line="260"/>
+            </w:pPr>
+            <w:r>
+              <w:rPr>
+                <w:b w:val="false"/>
+                <w:bCs w:val="false"/>
+                <w:sz w:val="18"/>
+                <w:szCs w:val="18"/>
+              </w:rPr>
+              <w:t xml:space="preserve">미사용 스키마 정리(Session.token, EncryptionKey)</w:t>
+            </w:r>
+          </w:p>
+        </w:tc>
+        <w:tc>
+          <w:tcPr>
+            <w:tcMar>
+              <w:top w:type="dxa" w:w="60"/>
+              <w:left w:type="dxa" w:w="100"/>
+              <w:bottom w:type="dxa" w:w="60"/>
+              <w:right w:type="dxa" w:w="100"/>
+            </w:tcMar>
+            <w:vAlign w:val="top"/>
+          </w:tcPr>
+          <w:p>
+            <w:pPr>
+              <w:spacing w:after="0" w:line="260"/>
+            </w:pPr>
+            <w:r>
+              <w:rPr>
+                <w:b w:val="false"/>
+                <w:bCs w:val="false"/>
+                <w:sz w:val="18"/>
+                <w:szCs w:val="18"/>
+              </w:rPr>
+              <w:t xml:space="preserve">Session.token(평문 컬럼)과 EncryptionKey 모델은 코드 어디에서도 사용되지 않는 죽은 스키마입니다. 실제 인증은 Supabase가, 필드 암호화는 FIELD_ENCRYPTION_KEY 환경변수가 처리합니다.</w:t>
+            </w:r>
+          </w:p>
+        </w:tc>
+        <w:tc>
+          <w:tcPr>
+            <w:tcMar>
+              <w:top w:type="dxa" w:w="60"/>
+              <w:left w:type="dxa" w:w="100"/>
+              <w:bottom w:type="dxa" w:w="60"/>
+              <w:right w:type="dxa" w:w="100"/>
+            </w:tcMar>
+            <w:vAlign w:val="top"/>
+          </w:tcPr>
+          <w:p>
+            <w:pPr>
+              <w:spacing w:after="0" w:line="260"/>
+            </w:pPr>
+            <w:r>
+              <w:rPr>
+                <w:b w:val="false"/>
+                <w:bCs w:val="false"/>
+                <w:sz w:val="18"/>
+                <w:szCs w:val="18"/>
+              </w:rPr>
+              <w:t xml:space="preserve">보안 감사 시 혼동을 피하려면 다음 스키마 변경 배치에 두 항목을 제거하는 마이그레이션을 포함하십시오.</w:t>
             </w:r>
           </w:p>
         </w:tc>

</xml_diff>

<commit_message>
feat: commercialization M1 — plan tiers, premium gating, marketing landing page
Adds the plan/billing foundation for the lean 3-month launch: an
Organization.plan (TRIAL/STARTER/GROWTH/ENTERPRISE) tier, a pure
plan->module access map gating 8 premium routes behind an upgrade
screen, a real marketing landing page at "/" (the old dev-status page
moved to "/status") with a public free-trial lead form, and terms/
privacy page stubs pending legal review.

Co-Authored-By: Claude Sonnet 5 <noreply@anthropic.com>
</commit_message>
<xml_diff>
--- a/docs/CIOS-직접-설정-가이드.docx
+++ b/docs/CIOS-직접-설정-가이드.docx
@@ -1699,6 +1699,83 @@
                 <w:szCs w:val="18"/>
               </w:rPr>
               <w:t xml:space="preserve">위 항목과 동일합니다. RESEND_API_KEY와 함께 설정해야 이메일이 발송됩니다.</w:t>
+            </w:r>
+          </w:p>
+        </w:tc>
+      </w:tr>
+      <w:tr>
+        <w:tc>
+          <w:tcPr>
+            <w:tcMar>
+              <w:top w:type="dxa" w:w="60"/>
+              <w:left w:type="dxa" w:w="100"/>
+              <w:bottom w:type="dxa" w:w="60"/>
+              <w:right w:type="dxa" w:w="100"/>
+            </w:tcMar>
+            <w:vAlign w:val="top"/>
+          </w:tcPr>
+          <w:p>
+            <w:pPr>
+              <w:spacing w:after="0" w:line="260"/>
+            </w:pPr>
+            <w:r>
+              <w:rPr>
+                <w:b w:val="false"/>
+                <w:bCs w:val="false"/>
+                <w:sz w:val="18"/>
+                <w:szCs w:val="18"/>
+              </w:rPr>
+              <w:t xml:space="preserve">SALES_NOTIFICATION_EMAIL</w:t>
+            </w:r>
+          </w:p>
+        </w:tc>
+        <w:tc>
+          <w:tcPr>
+            <w:tcMar>
+              <w:top w:type="dxa" w:w="60"/>
+              <w:left w:type="dxa" w:w="100"/>
+              <w:bottom w:type="dxa" w:w="60"/>
+              <w:right w:type="dxa" w:w="100"/>
+            </w:tcMar>
+            <w:vAlign w:val="top"/>
+          </w:tcPr>
+          <w:p>
+            <w:pPr>
+              <w:spacing w:after="0" w:line="260"/>
+            </w:pPr>
+            <w:r>
+              <w:rPr>
+                <w:b w:val="false"/>
+                <w:bCs w:val="false"/>
+                <w:sz w:val="18"/>
+                <w:szCs w:val="18"/>
+              </w:rPr>
+              <w:t xml:space="preserve">선택</w:t>
+            </w:r>
+          </w:p>
+        </w:tc>
+        <w:tc>
+          <w:tcPr>
+            <w:tcMar>
+              <w:top w:type="dxa" w:w="60"/>
+              <w:left w:type="dxa" w:w="100"/>
+              <w:bottom w:type="dxa" w:w="60"/>
+              <w:right w:type="dxa" w:w="100"/>
+            </w:tcMar>
+            <w:vAlign w:val="top"/>
+          </w:tcPr>
+          <w:p>
+            <w:pPr>
+              <w:spacing w:after="0" w:line="260"/>
+            </w:pPr>
+            <w:r>
+              <w:rPr>
+                <w:b w:val="false"/>
+                <w:bCs w:val="false"/>
+                <w:sz w:val="18"/>
+                <w:szCs w:val="18"/>
+              </w:rPr>
+              <w:t xml:space="preserve">랜딩페이지 무료체험 신청 폼의 알림 수신 주소입니다. 미설정 시 신청 내역은 TrialRequest 테이블에만 저장되고 알림 이메일은 발송되지 않습니다.</w:t>
             </w:r>
           </w:p>
         </w:tc>

</xml_diff>

<commit_message>
docs: add commercialization hand-off tasks to the setup guide
Adds a 13th section to CIOS-직접-설정-가이드.docx listing what's left
for the user after this session's M1 commercialization work: merging
the PR, confirming the (currently hypothetical) pricing table, setting
SALES_NOTIFICATION_EMAIL, starting legal review of the terms/privacy
stubs, and the M2/M3 Toss Payments and pilot-outreach steps from the
approved plan.

Co-Authored-By: Claude Sonnet 5 <noreply@anthropic.com>
</commit_message>
<xml_diff>
--- a/docs/CIOS-직접-설정-가이드.docx
+++ b/docs/CIOS-직접-설정-가이드.docx
@@ -7920,6 +7920,369 @@
       </w:r>
       <w:r>
         <w:t xml:space="preserve">운영 개시 전에 최소한 '실제 데이터베이스 대상 실행 검증'과 '상용 배출계수 데이터' 항목의 판단이 완료되었습니다.</w:t>
+      </w:r>
+    </w:p>
+    <w:p>
+      <w:pPr>
+        <w:pStyle w:val="Heading1"/>
+        <w:spacing w:after="140" w:before="320"/>
+      </w:pPr>
+      <w:r>
+        <w:rPr>
+          <w:b/>
+          <w:bCs/>
+        </w:rPr>
+        <w:t xml:space="preserve">13. 상용화(커머셜라이제이션) 진행 — 사용자가 직접 해야 할 일</w:t>
+      </w:r>
+    </w:p>
+    <w:p>
+      <w:pPr>
+        <w:spacing w:after="120" w:line="300"/>
+      </w:pPr>
+      <w:r>
+        <w:rPr>
+          <w:b w:val="false"/>
+          <w:bCs w:val="false"/>
+        </w:rPr>
+        <w:t xml:space="preserve">린(Lean) 3개월 출시 계획(M1~M3) 중 Claude Code가 대신할 수 없는 항목입니다. 요금제·게이팅·랜딩페이지·무료체험 신청·약관 뼈대는 코드로 이미 구현·검증되었고, 남은 것은 가격 확정, 결제 가맹점 가입, 법률 자문, 영업 활동입니다.</w:t>
+      </w:r>
+    </w:p>
+    <w:p>
+      <w:pPr>
+        <w:spacing w:after="120" w:line="300"/>
+      </w:pPr>
+      <w:r>
+        <w:rPr>
+          <w:b w:val="false"/>
+          <w:bCs w:val="false"/>
+        </w:rPr>
+        <w:t xml:space="preserve">이번 개발 세션에서 완료된 것: Organization.plan(TRIAL/STARTER/GROWTH/ENTERPRISE) 요금제 스키마, 요금제별 모듈 접근 제어(8개 프리미엄 라우트 잠금), 새 랜딩페이지(/)와 무료체험 신청 폼·저장 로직, 이용약관·개인정보처리방침 뼈대(/legal/terms, /legal/privacy). lint·typecheck·test(1,660개)·build 전부 통과했고 origin/feat/cios-core-implementation-gaps 브랜치에 커밋·푸시되어 있습니다.</w:t>
+      </w:r>
+    </w:p>
+    <w:p>
+      <w:pPr>
+        <w:spacing w:after="120" w:line="300"/>
+      </w:pPr>
+      <w:r>
+        <w:rPr>
+          <w:b w:val="false"/>
+          <w:bCs w:val="false"/>
+        </w:rPr>
+        <w:t xml:space="preserve">1개월차 마무리</w:t>
+      </w:r>
+    </w:p>
+    <w:p>
+      <w:pPr>
+        <w:spacing w:after="100" w:line="300"/>
+        <w:ind w:left="360" w:hanging="360"/>
+      </w:pPr>
+      <w:r>
+        <w:rPr>
+          <w:b/>
+          <w:bCs/>
+        </w:rPr>
+        <w:t xml:space="preserve">1. </w:t>
+      </w:r>
+      <w:r>
+        <w:t xml:space="preserve">GitHub에서 feat/cios-core-implementation-gaps → main으로 Pull Request를 생성하고 병합합니다. origin/feat/cios-core-implementation은 이번 작업과 무관한 커밋이 섞여 갈라져 있으므로 사용하지 마십시오.</w:t>
+      </w:r>
+    </w:p>
+    <w:p>
+      <w:pPr>
+        <w:spacing w:after="100" w:line="300"/>
+        <w:ind w:left="360" w:hanging="360"/>
+      </w:pPr>
+      <w:r>
+        <w:rPr>
+          <w:b/>
+          <w:bCs/>
+        </w:rPr>
+        <w:t xml:space="preserve">2. </w:t>
+      </w:r>
+      <w:r>
+        <w:t xml:space="preserve">가격표를 확정합니다. 현재 랜딩페이지의 스타터 29만원 · 그로스 89만원 · 엔터프라이즈 맞춤견적은 가설 값입니다. 타겟 고객(파일럿 후보)과의 대화 결과를 src/lib/i18n/dictionaries/ko.ts·en.ts의 marketing.pricing.* 키에 반영하도록 Claude Code에 요청하십시오.</w:t>
+      </w:r>
+    </w:p>
+    <w:p>
+      <w:pPr>
+        <w:spacing w:after="100" w:line="300"/>
+        <w:ind w:left="360" w:hanging="360"/>
+      </w:pPr>
+      <w:r>
+        <w:rPr>
+          <w:b/>
+          <w:bCs/>
+        </w:rPr>
+        <w:t xml:space="preserve">3. </w:t>
+      </w:r>
+      <w:r>
+        <w:t xml:space="preserve">배포 환경(Vercel 등)에 SALES_NOTIFICATION_EMAIL을 등록해 무료체험 신청 알림을 받으십시오. 실제 이메일 발송까지 받으려면 RESEND_API_KEY·NOTIFICATION_EMAIL_FROM도 함께 설정해야 합니다(이 문서 앞부분의 환경변수 표 참고).</w:t>
+      </w:r>
+    </w:p>
+    <w:p>
+      <w:pPr>
+        <w:spacing w:after="100" w:line="300"/>
+        <w:ind w:left="360" w:hanging="360"/>
+      </w:pPr>
+      <w:r>
+        <w:rPr>
+          <w:b/>
+          <w:bCs/>
+        </w:rPr>
+        <w:t xml:space="preserve">4. </w:t>
+      </w:r>
+      <w:r>
+        <w:t xml:space="preserve">법률 자문을 시작합니다. /legal/terms, /legal/privacy 두 페이지는 조항 구조만 만들어져 있고 본문은 전부 '[법률 검토 필요]' 표시입니다. 변호사·법무 자문을 통해 실제 이용약관·개인정보처리방침 조항(요금 환불 정책, 개인정보 수집 항목, 제3자 제공 여부 등)을 확정하십시오.</w:t>
+      </w:r>
+    </w:p>
+    <w:p>
+      <w:pPr>
+        <w:spacing w:after="120" w:line="300"/>
+      </w:pPr>
+      <w:r>
+        <w:rPr>
+          <w:b w:val="false"/>
+          <w:bCs w:val="false"/>
+        </w:rPr>
+        <w:t xml:space="preserve">2개월차 — 결제 리허설 · 파일럿 준비</w:t>
+      </w:r>
+    </w:p>
+    <w:p>
+      <w:pPr>
+        <w:spacing w:after="100" w:line="300"/>
+        <w:ind w:left="360" w:hanging="360"/>
+      </w:pPr>
+      <w:r>
+        <w:rPr>
+          <w:b/>
+          <w:bCs/>
+        </w:rPr>
+        <w:t xml:space="preserve">1. </w:t>
+      </w:r>
+      <w:r>
+        <w:t xml:space="preserve">https://www.tosspayments.com 에서 가맹점 심사를 신청합니다. 사업자등록증 등 서류 심사에 통상 수일이 소요됩니다.</w:t>
+      </w:r>
+    </w:p>
+    <w:p>
+      <w:pPr>
+        <w:spacing w:after="100" w:line="300"/>
+        <w:ind w:left="360" w:hanging="360"/>
+      </w:pPr>
+      <w:r>
+        <w:rPr>
+          <w:b/>
+          <w:bCs/>
+        </w:rPr>
+        <w:t xml:space="preserve">2. </w:t>
+      </w:r>
+      <w:r>
+        <w:t xml:space="preserve">심사 통과 후 결제링크(Payment Link) 기능으로 소액 결제를 최소 1회 리허설합니다. v1은 자동 정기결제가 아니라 결제링크 발송 → 결제 확인 → 수동으로 조직의 plan을 활성화하는 방식입니다.</w:t>
+      </w:r>
+    </w:p>
+    <w:p>
+      <w:pPr>
+        <w:spacing w:after="100" w:line="300"/>
+        <w:ind w:left="360" w:hanging="360"/>
+      </w:pPr>
+      <w:r>
+        <w:rPr>
+          <w:b/>
+          <w:bCs/>
+        </w:rPr>
+        <w:t xml:space="preserve">3. </w:t>
+      </w:r>
+      <w:r>
+        <w:t xml:space="preserve">확정된 약관 문구를 legal 페이지에 반영하도록 Claude Code에 전달합니다(전체 조항 텍스트를 붙여넣으면 됩니다).</w:t>
+      </w:r>
+    </w:p>
+    <w:p>
+      <w:pPr>
+        <w:spacing w:after="100" w:line="300"/>
+        <w:ind w:left="360" w:hanging="360"/>
+      </w:pPr>
+      <w:r>
+        <w:rPr>
+          <w:b/>
+          <w:bCs/>
+        </w:rPr>
+        <w:t xml:space="preserve">4. </w:t>
+      </w:r>
+      <w:r>
+        <w:t xml:space="preserve">파일럿 후보 3~5곳을 컨택합니다. 국내 중견·중소 제조업 중 Scope 1·2·3 규제 대응이 급한 곳을 우선하고, 랜딩페이지의 무료체험 신청 폼으로 유도하십시오.</w:t>
+      </w:r>
+    </w:p>
+    <w:p>
+      <w:pPr>
+        <w:spacing w:after="120" w:line="300"/>
+      </w:pPr>
+      <w:r>
+        <w:rPr>
+          <w:b w:val="false"/>
+          <w:bCs w:val="false"/>
+        </w:rPr>
+        <w:t xml:space="preserve">3개월차 — 파일럿 운영 · 정식 출시</w:t>
+      </w:r>
+    </w:p>
+    <w:p>
+      <w:pPr>
+        <w:spacing w:after="100" w:line="300"/>
+        <w:ind w:left="360" w:hanging="360"/>
+      </w:pPr>
+      <w:r>
+        <w:rPr>
+          <w:b/>
+          <w:bCs/>
+        </w:rPr>
+        <w:t xml:space="preserve">1. </w:t>
+      </w:r>
+      <w:r>
+        <w:t xml:space="preserve">무료체험 신청이 들어오면(TrialRequest 테이블 또는 알림 메일로 확인) 보안 화면의 '구성원' 탭 초대 흐름으로 조직을 만들고 담당자를 관리자로 초대합니다. 자동 가입은 v1 범위가 아닙니다.</w:t>
+      </w:r>
+    </w:p>
+    <w:p>
+      <w:pPr>
+        <w:spacing w:after="100" w:line="300"/>
+        <w:ind w:left="360" w:hanging="360"/>
+      </w:pPr>
+      <w:r>
+        <w:rPr>
+          <w:b/>
+          <w:bCs/>
+        </w:rPr>
+        <w:t xml:space="preserve">2. </w:t>
+      </w:r>
+      <w:r>
+        <w:t xml:space="preserve">결제가 확인되면 조직의 plan을 STARTER/GROWTH/ENTERPRISE로 전환합니다. 2개월차에 만들 scripts/activate-plan.ts(CLI)로 처리하고, 별도 관리자 웹 화면은 v1에서 만들지 않습니다.</w:t>
+      </w:r>
+    </w:p>
+    <w:p>
+      <w:pPr>
+        <w:spacing w:after="100" w:line="300"/>
+        <w:ind w:left="360" w:hanging="360"/>
+      </w:pPr>
+      <w:r>
+        <w:rPr>
+          <w:b/>
+          <w:bCs/>
+        </w:rPr>
+        <w:t xml:space="preserve">3. </w:t>
+      </w:r>
+      <w:r>
+        <w:t xml:space="preserve">파일럿 피드백을 근거로 가격 정책을 재검증합니다. 1개월차에 확정한 가격표는 가설이므로 실제 대화 결과에 따라 조정하십시오.</w:t>
+      </w:r>
+    </w:p>
+    <w:p>
+      <w:pPr>
+        <w:spacing w:after="100" w:line="300"/>
+        <w:ind w:left="360" w:hanging="360"/>
+      </w:pPr>
+      <w:r>
+        <w:rPr>
+          <w:b/>
+          <w:bCs/>
+        </w:rPr>
+        <w:t xml:space="preserve">4. </w:t>
+      </w:r>
+      <w:r>
+        <w:t xml:space="preserve">정식 출시를 공지합니다.</w:t>
+      </w:r>
+    </w:p>
+    <w:p>
+      <w:pPr>
+        <w:pStyle w:val="Heading2"/>
+        <w:spacing w:after="100" w:before="200"/>
+      </w:pPr>
+      <w:r>
+        <w:rPr>
+          <w:b/>
+          <w:bCs/>
+        </w:rPr>
+        <w:t xml:space="preserve">예상 비용</w:t>
+      </w:r>
+    </w:p>
+    <w:p>
+      <w:pPr>
+        <w:spacing w:after="120" w:line="300"/>
+      </w:pPr>
+      <w:r>
+        <w:rPr>
+          <w:b w:val="false"/>
+          <w:bCs w:val="false"/>
+        </w:rPr>
+        <w:t xml:space="preserve">Toss Payments 가맹점 수수료(신용카드 기준 약 2.5~3.5%, 업종·계약조건에 따라 상이). 법률 자문 비용은 별도 견적. 그 외 항목은 무료입니다.</w:t>
+      </w:r>
+    </w:p>
+    <w:p>
+      <w:pPr>
+        <w:pStyle w:val="Heading2"/>
+        <w:spacing w:after="100" w:before="200"/>
+      </w:pPr>
+      <w:r>
+        <w:rPr>
+          <w:b/>
+          <w:bCs/>
+        </w:rPr>
+        <w:t xml:space="preserve">완료 확인 방법</w:t>
+      </w:r>
+    </w:p>
+    <w:p>
+      <w:pPr>
+        <w:spacing w:after="100" w:line="300"/>
+        <w:ind w:left="360" w:hanging="240"/>
+      </w:pPr>
+      <w:r>
+        <w:t xml:space="preserve">· </w:t>
+      </w:r>
+      <w:r>
+        <w:t xml:space="preserve">feat/cios-core-implementation-gaps의 변경사항이 main에 병합되어 있습니다.</w:t>
+      </w:r>
+    </w:p>
+    <w:p>
+      <w:pPr>
+        <w:spacing w:after="100" w:line="300"/>
+        <w:ind w:left="360" w:hanging="240"/>
+      </w:pPr>
+      <w:r>
+        <w:t xml:space="preserve">· </w:t>
+      </w:r>
+      <w:r>
+        <w:t xml:space="preserve">배포 환경에 SALES_NOTIFICATION_EMAIL이 설정되어 있고, 테스트로 무료체험 신청을 제출하면 알림을 수신합니다.</w:t>
+      </w:r>
+    </w:p>
+    <w:p>
+      <w:pPr>
+        <w:spacing w:after="100" w:line="300"/>
+        <w:ind w:left="360" w:hanging="240"/>
+      </w:pPr>
+      <w:r>
+        <w:t xml:space="preserve">· </w:t>
+      </w:r>
+      <w:r>
+        <w:t xml:space="preserve">/legal/terms, /legal/privacy 어디에도 '[법률 검토 필요]' 표시가 남아있지 않습니다.</w:t>
+      </w:r>
+    </w:p>
+    <w:p>
+      <w:pPr>
+        <w:spacing w:after="100" w:line="300"/>
+        <w:ind w:left="360" w:hanging="240"/>
+      </w:pPr>
+      <w:r>
+        <w:t xml:space="preserve">· </w:t>
+      </w:r>
+      <w:r>
+        <w:t xml:space="preserve">Toss Payments 결제링크로 소액 결제 테스트가 실제로 성공했습니다.</w:t>
+      </w:r>
+    </w:p>
+    <w:p>
+      <w:pPr>
+        <w:spacing w:after="100" w:line="300"/>
+        <w:ind w:left="360" w:hanging="240"/>
+      </w:pPr>
+      <w:r>
+        <w:t xml:space="preserve">· </w:t>
+      </w:r>
+      <w:r>
+        <w:t xml:space="preserve">파일럿 후보 최소 1곳과 접촉해 무료체험 신청 또는 다음 단계 약속을 받았습니다.</w:t>
       </w:r>
     </w:p>
     <w:p>

</xml_diff>